<commit_message>
feat: Inventarverwaltung umfassend erweitern
</commit_message>
<xml_diff>
--- a/Das Tool soll folgende Funktionen haben.docx
+++ b/Das Tool soll folgende Funktionen haben.docx
@@ -342,15 +342,7 @@
       </w:r>
       <w:proofErr w:type="spellEnd"/>
       <w:r>
-        <w:t xml:space="preserve"> über </w:t>
-      </w:r>
-      <w:proofErr w:type="spellStart"/>
-      <w:r>
-        <w:t>das</w:t>
-      </w:r>
-      <w:proofErr w:type="spellEnd"/>
-      <w:r>
-        <w:t xml:space="preserve"> Smartphone </w:t>
+        <w:t xml:space="preserve"> über das Smartphone </w:t>
       </w:r>
       <w:proofErr w:type="gramStart"/>
       <w:r>
@@ -443,6 +435,9 @@
       <w:r>
         <w:t>Objektbrowser</w:t>
       </w:r>
+      <w:r>
+        <w:t xml:space="preserve"> (check)</w:t>
+      </w:r>
     </w:p>
     <w:p>
       <w:pPr>
@@ -454,6 +449,9 @@
       </w:pPr>
       <w:r>
         <w:t xml:space="preserve">Filter </w:t>
+      </w:r>
+      <w:r>
+        <w:t>(check)</w:t>
       </w:r>
     </w:p>
     <w:p>

</xml_diff>